<commit_message>
fix: repair resume document
</commit_message>
<xml_diff>
--- a/public/resume/JP_Dumas_Final_Resume.docx
+++ b/public/resume/JP_Dumas_Final_Resume.docx
@@ -6,7 +6,7 @@
       <w:pPr>
         <w:pStyle w:val="Default"/>
         <w:bidi w:val="0"/>
-        <w:jc w:val="start"/>
+        <w:jc w:val="left"/>
         <w:rPr/>
       </w:pPr>
       <w:r>
@@ -17,22 +17,22 @@
       <w:pPr>
         <w:pStyle w:val="Default"/>
         <w:bidi w:val="0"/>
-        <w:jc w:val="start"/>
+        <w:jc w:val="left"/>
         <w:rPr>
           <w:color w:val="auto"/>
         </w:rPr>
       </w:pPr>
       <w:r>
         <w:rPr>
-          <w:color w:val="000000"/>
-        </w:rPr>
-      </w:r>
-    </w:p>
-    <w:p>
-      <w:pPr>
-        <w:pStyle w:val="Default"/>
-        <w:bidi w:val="0"/>
-        <w:jc w:val="start"/>
+          <w:color w:val="auto"/>
+        </w:rPr>
+      </w:r>
+    </w:p>
+    <w:p>
+      <w:pPr>
+        <w:pStyle w:val="Default"/>
+        <w:bidi w:val="0"/>
+        <w:jc w:val="left"/>
         <w:rPr>
           <w:b w:val="false"/>
           <w:strike w:val="false"/>
@@ -56,7 +56,7 @@
       <w:pPr>
         <w:pStyle w:val="Default"/>
         <w:bidi w:val="0"/>
-        <w:jc w:val="start"/>
+        <w:jc w:val="left"/>
         <w:rPr>
           <w:b w:val="false"/>
           <w:strike w:val="false"/>
@@ -75,18 +75,7 @@
           <w:sz w:val="18"/>
           <w:u w:val="none"/>
         </w:rPr>
-        <w:t xml:space="preserve">St. Augustine, FL | linkedin.com/in/james-dumas | jpsportfolio.com </w:t>
-      </w:r>
-      <w:r>
-        <w:rPr>
-          <w:b w:val="false"/>
-          <w:strike w:val="false"/>
-          <w:dstrike w:val="false"/>
-          <w:color w:val="444444"/>
-          <w:sz w:val="18"/>
-          <w:u w:val="none"/>
-        </w:rPr>
-        <w:t xml:space="preserve">| Email: </w:t>
+        <w:t xml:space="preserve">St. Augustine, FL | linkedin.com/in/james-dumas | jpsportfolio.com | Email: </w:t>
       </w:r>
       <w:hyperlink r:id="rId2">
         <w:r>
@@ -118,7 +107,7 @@
       <w:pPr>
         <w:pStyle w:val="Default"/>
         <w:bidi w:val="0"/>
-        <w:jc w:val="start"/>
+        <w:jc w:val="left"/>
         <w:rPr>
           <w:b w:val="false"/>
           <w:strike w:val="false"/>
@@ -143,7 +132,7 @@
       <w:pPr>
         <w:pStyle w:val="Default"/>
         <w:bidi w:val="0"/>
-        <w:jc w:val="start"/>
+        <w:jc w:val="left"/>
         <w:rPr>
           <w:b w:val="false"/>
           <w:strike w:val="false"/>
@@ -167,7 +156,7 @@
       <w:pPr>
         <w:pStyle w:val="Default"/>
         <w:bidi w:val="0"/>
-        <w:jc w:val="start"/>
+        <w:jc w:val="left"/>
         <w:rPr>
           <w:b w:val="false"/>
           <w:strike w:val="false"/>
@@ -191,30 +180,30 @@
       <w:pPr>
         <w:pStyle w:val="Default"/>
         <w:bidi w:val="0"/>
-        <w:jc w:val="start"/>
-        <w:rPr>
-          <w:b w:val="false"/>
-          <w:strike w:val="false"/>
-          <w:dstrike w:val="false"/>
-          <w:sz w:val="18"/>
-          <w:u w:val="none"/>
-        </w:rPr>
-      </w:pPr>
-      <w:r>
-        <w:rPr>
-          <w:b w:val="false"/>
-          <w:strike w:val="false"/>
-          <w:dstrike w:val="false"/>
-          <w:sz w:val="18"/>
-          <w:u w:val="none"/>
-        </w:rPr>
-      </w:r>
-    </w:p>
-    <w:p>
-      <w:pPr>
-        <w:pStyle w:val="Default"/>
-        <w:bidi w:val="0"/>
-        <w:jc w:val="start"/>
+        <w:jc w:val="left"/>
+        <w:rPr>
+          <w:b w:val="false"/>
+          <w:strike w:val="false"/>
+          <w:dstrike w:val="false"/>
+          <w:sz w:val="18"/>
+          <w:u w:val="none"/>
+        </w:rPr>
+      </w:pPr>
+      <w:r>
+        <w:rPr>
+          <w:b w:val="false"/>
+          <w:strike w:val="false"/>
+          <w:dstrike w:val="false"/>
+          <w:sz w:val="18"/>
+          <w:u w:val="none"/>
+        </w:rPr>
+      </w:r>
+    </w:p>
+    <w:p>
+      <w:pPr>
+        <w:pStyle w:val="Default"/>
+        <w:bidi w:val="0"/>
+        <w:jc w:val="left"/>
         <w:rPr>
           <w:b w:val="false"/>
           <w:strike w:val="false"/>
@@ -238,7 +227,7 @@
       <w:pPr>
         <w:pStyle w:val="Default"/>
         <w:bidi w:val="0"/>
-        <w:jc w:val="start"/>
+        <w:jc w:val="left"/>
         <w:rPr>
           <w:b w:val="false"/>
           <w:strike w:val="false"/>
@@ -361,30 +350,30 @@
       <w:pPr>
         <w:pStyle w:val="Default"/>
         <w:bidi w:val="0"/>
-        <w:jc w:val="start"/>
-        <w:rPr>
-          <w:b w:val="false"/>
-          <w:strike w:val="false"/>
-          <w:dstrike w:val="false"/>
-          <w:sz w:val="18"/>
-          <w:u w:val="none"/>
-        </w:rPr>
-      </w:pPr>
-      <w:r>
-        <w:rPr>
-          <w:b w:val="false"/>
-          <w:strike w:val="false"/>
-          <w:dstrike w:val="false"/>
-          <w:sz w:val="18"/>
-          <w:u w:val="none"/>
-        </w:rPr>
-      </w:r>
-    </w:p>
-    <w:p>
-      <w:pPr>
-        <w:pStyle w:val="Default"/>
-        <w:bidi w:val="0"/>
-        <w:jc w:val="start"/>
+        <w:jc w:val="left"/>
+        <w:rPr>
+          <w:b w:val="false"/>
+          <w:strike w:val="false"/>
+          <w:dstrike w:val="false"/>
+          <w:sz w:val="18"/>
+          <w:u w:val="none"/>
+        </w:rPr>
+      </w:pPr>
+      <w:r>
+        <w:rPr>
+          <w:b w:val="false"/>
+          <w:strike w:val="false"/>
+          <w:dstrike w:val="false"/>
+          <w:sz w:val="18"/>
+          <w:u w:val="none"/>
+        </w:rPr>
+      </w:r>
+    </w:p>
+    <w:p>
+      <w:pPr>
+        <w:pStyle w:val="Default"/>
+        <w:bidi w:val="0"/>
+        <w:jc w:val="left"/>
         <w:rPr>
           <w:b w:val="false"/>
           <w:strike w:val="false"/>
@@ -408,7 +397,7 @@
       <w:pPr>
         <w:pStyle w:val="Default"/>
         <w:bidi w:val="0"/>
-        <w:jc w:val="start"/>
+        <w:jc w:val="left"/>
         <w:rPr>
           <w:b w:val="false"/>
           <w:strike w:val="false"/>
@@ -452,7 +441,7 @@
       <w:pPr>
         <w:pStyle w:val="Default"/>
         <w:bidi w:val="0"/>
-        <w:jc w:val="start"/>
+        <w:jc w:val="left"/>
         <w:rPr>
           <w:b w:val="false"/>
           <w:i w:val="false"/>
@@ -480,7 +469,7 @@
       <w:pPr>
         <w:pStyle w:val="Default"/>
         <w:bidi w:val="0"/>
-        <w:jc w:val="start"/>
+        <w:jc w:val="left"/>
         <w:rPr>
           <w:b w:val="false"/>
           <w:i w:val="false"/>
@@ -507,21 +496,14 @@
           <w:sz w:val="18"/>
           <w:szCs w:val="18"/>
         </w:rPr>
-        <w:t>Resolved complex system and HL7 integration issues in high-risk clinical environments, diagnosing data and database inconsistencies to ensure accuracy and minimize downti</w:t>
-      </w:r>
-      <w:r>
-        <w:rPr>
-          <w:sz w:val="18"/>
-          <w:szCs w:val="18"/>
-        </w:rPr>
-        <w:t>me</w:t>
-      </w:r>
-    </w:p>
-    <w:p>
-      <w:pPr>
-        <w:pStyle w:val="Default"/>
-        <w:bidi w:val="0"/>
-        <w:jc w:val="start"/>
+        <w:t>Resolved complex system and HL7 integration issues in high-risk clinical environments, diagnosing data and database inconsistencies to ensure accuracy and minimize downtime</w:t>
+      </w:r>
+    </w:p>
+    <w:p>
+      <w:pPr>
+        <w:pStyle w:val="Default"/>
+        <w:bidi w:val="0"/>
+        <w:jc w:val="left"/>
         <w:rPr>
           <w:b w:val="false"/>
           <w:i w:val="false"/>
@@ -559,7 +541,7 @@
       <w:pPr>
         <w:pStyle w:val="Default"/>
         <w:bidi w:val="0"/>
-        <w:jc w:val="start"/>
+        <w:jc w:val="left"/>
         <w:rPr>
           <w:b w:val="false"/>
           <w:i w:val="false"/>
@@ -593,32 +575,32 @@
       <w:pPr>
         <w:pStyle w:val="Default"/>
         <w:bidi w:val="0"/>
-        <w:jc w:val="start"/>
-        <w:rPr>
-          <w:b w:val="false"/>
-          <w:i w:val="false"/>
-          <w:strike w:val="false"/>
-          <w:dstrike w:val="false"/>
-          <w:sz w:val="20"/>
-          <w:u w:val="none"/>
-        </w:rPr>
-      </w:pPr>
-      <w:r>
-        <w:rPr>
-          <w:b w:val="false"/>
-          <w:i w:val="false"/>
-          <w:strike w:val="false"/>
-          <w:dstrike w:val="false"/>
-          <w:sz w:val="20"/>
-          <w:u w:val="none"/>
-        </w:rPr>
-      </w:r>
-    </w:p>
-    <w:p>
-      <w:pPr>
-        <w:pStyle w:val="Default"/>
-        <w:bidi w:val="0"/>
-        <w:jc w:val="start"/>
+        <w:jc w:val="left"/>
+        <w:rPr>
+          <w:b w:val="false"/>
+          <w:i w:val="false"/>
+          <w:strike w:val="false"/>
+          <w:dstrike w:val="false"/>
+          <w:sz w:val="20"/>
+          <w:u w:val="none"/>
+        </w:rPr>
+      </w:pPr>
+      <w:r>
+        <w:rPr>
+          <w:b w:val="false"/>
+          <w:i w:val="false"/>
+          <w:strike w:val="false"/>
+          <w:dstrike w:val="false"/>
+          <w:sz w:val="20"/>
+          <w:u w:val="none"/>
+        </w:rPr>
+      </w:r>
+    </w:p>
+    <w:p>
+      <w:pPr>
+        <w:pStyle w:val="Default"/>
+        <w:bidi w:val="0"/>
+        <w:jc w:val="left"/>
         <w:rPr>
           <w:b w:val="false"/>
           <w:i w:val="false"/>
@@ -666,7 +648,7 @@
       <w:pPr>
         <w:pStyle w:val="Default"/>
         <w:bidi w:val="0"/>
-        <w:jc w:val="start"/>
+        <w:jc w:val="left"/>
         <w:rPr>
           <w:b w:val="false"/>
           <w:i w:val="false"/>
@@ -694,7 +676,7 @@
       <w:pPr>
         <w:pStyle w:val="Default"/>
         <w:bidi w:val="0"/>
-        <w:jc w:val="start"/>
+        <w:jc w:val="left"/>
         <w:rPr>
           <w:b w:val="false"/>
           <w:i w:val="false"/>
@@ -733,7 +715,7 @@
       <w:pPr>
         <w:pStyle w:val="Default"/>
         <w:bidi w:val="0"/>
-        <w:jc w:val="start"/>
+        <w:jc w:val="left"/>
         <w:rPr>
           <w:b w:val="false"/>
           <w:i w:val="false"/>
@@ -762,32 +744,32 @@
       <w:pPr>
         <w:pStyle w:val="Default"/>
         <w:bidi w:val="0"/>
-        <w:jc w:val="start"/>
-        <w:rPr>
-          <w:b w:val="false"/>
-          <w:i w:val="false"/>
-          <w:strike w:val="false"/>
-          <w:dstrike w:val="false"/>
-          <w:sz w:val="20"/>
-          <w:u w:val="none"/>
-        </w:rPr>
-      </w:pPr>
-      <w:r>
-        <w:rPr>
-          <w:b w:val="false"/>
-          <w:i w:val="false"/>
-          <w:strike w:val="false"/>
-          <w:dstrike w:val="false"/>
-          <w:sz w:val="20"/>
-          <w:u w:val="none"/>
-        </w:rPr>
-      </w:r>
-    </w:p>
-    <w:p>
-      <w:pPr>
-        <w:pStyle w:val="Default"/>
-        <w:bidi w:val="0"/>
-        <w:jc w:val="start"/>
+        <w:jc w:val="left"/>
+        <w:rPr>
+          <w:b w:val="false"/>
+          <w:i w:val="false"/>
+          <w:strike w:val="false"/>
+          <w:dstrike w:val="false"/>
+          <w:sz w:val="20"/>
+          <w:u w:val="none"/>
+        </w:rPr>
+      </w:pPr>
+      <w:r>
+        <w:rPr>
+          <w:b w:val="false"/>
+          <w:i w:val="false"/>
+          <w:strike w:val="false"/>
+          <w:dstrike w:val="false"/>
+          <w:sz w:val="20"/>
+          <w:u w:val="none"/>
+        </w:rPr>
+      </w:r>
+    </w:p>
+    <w:p>
+      <w:pPr>
+        <w:pStyle w:val="Default"/>
+        <w:bidi w:val="0"/>
+        <w:jc w:val="left"/>
         <w:rPr>
           <w:b w:val="false"/>
           <w:i w:val="false"/>
@@ -835,7 +817,7 @@
       <w:pPr>
         <w:pStyle w:val="Default"/>
         <w:bidi w:val="0"/>
-        <w:jc w:val="start"/>
+        <w:jc w:val="left"/>
         <w:rPr>
           <w:b w:val="false"/>
           <w:i w:val="false"/>
@@ -856,8 +838,157 @@
           <w:sz w:val="18"/>
           <w:u w:val="none"/>
         </w:rPr>
-        <w:t xml:space="preserve">Residential Construction | </w:t>
-      </w:r>
+        <w:t>Residential Construction | Panama City Beach, FL and Birmingham, AL</w:t>
+      </w:r>
+    </w:p>
+    <w:p>
+      <w:pPr>
+        <w:pStyle w:val="Default"/>
+        <w:bidi w:val="0"/>
+        <w:jc w:val="left"/>
+        <w:rPr>
+          <w:b w:val="false"/>
+          <w:i w:val="false"/>
+          <w:strike w:val="false"/>
+          <w:dstrike w:val="false"/>
+          <w:sz w:val="20"/>
+          <w:u w:val="none"/>
+        </w:rPr>
+      </w:pPr>
+      <w:r>
+        <w:rPr>
+          <w:b w:val="false"/>
+          <w:i w:val="false"/>
+          <w:strike w:val="false"/>
+          <w:dstrike w:val="false"/>
+          <w:sz w:val="18"/>
+          <w:szCs w:val="18"/>
+          <w:u w:val="none"/>
+        </w:rPr>
+        <w:t>•</w:t>
+      </w:r>
+      <w:r>
+        <w:rPr>
+          <w:sz w:val="18"/>
+          <w:szCs w:val="18"/>
+        </w:rPr>
+        <w:t xml:space="preserve">Managed 15–20 concurrent residential projects, coordinating 20–30 subcontractors while overseeing budgets up to $5M and consistently delivering on time and within scope </w:t>
+      </w:r>
+    </w:p>
+    <w:p>
+      <w:pPr>
+        <w:pStyle w:val="Default"/>
+        <w:bidi w:val="0"/>
+        <w:jc w:val="left"/>
+        <w:rPr>
+          <w:b w:val="false"/>
+          <w:i w:val="false"/>
+          <w:strike w:val="false"/>
+          <w:dstrike w:val="false"/>
+          <w:sz w:val="20"/>
+          <w:u w:val="none"/>
+        </w:rPr>
+      </w:pPr>
+      <w:r>
+        <w:rPr>
+          <w:b w:val="false"/>
+          <w:i w:val="false"/>
+          <w:strike w:val="false"/>
+          <w:dstrike w:val="false"/>
+          <w:sz w:val="20"/>
+          <w:u w:val="none"/>
+        </w:rPr>
+      </w:r>
+    </w:p>
+    <w:p>
+      <w:pPr>
+        <w:pStyle w:val="Default"/>
+        <w:bidi w:val="0"/>
+        <w:jc w:val="left"/>
+        <w:rPr>
+          <w:b w:val="false"/>
+          <w:i w:val="false"/>
+          <w:strike w:val="false"/>
+          <w:dstrike w:val="false"/>
+          <w:sz w:val="20"/>
+          <w:u w:val="none"/>
+        </w:rPr>
+      </w:pPr>
+      <w:r>
+        <w:rPr>
+          <w:b/>
+          <w:i w:val="false"/>
+          <w:strike w:val="false"/>
+          <w:dstrike w:val="false"/>
+          <w:sz w:val="20"/>
+          <w:u w:val="none"/>
+        </w:rPr>
+        <w:t xml:space="preserve">MILITARY &amp; LEADERSHIP </w:t>
+      </w:r>
+    </w:p>
+    <w:p>
+      <w:pPr>
+        <w:pStyle w:val="Default"/>
+        <w:bidi w:val="0"/>
+        <w:jc w:val="left"/>
+        <w:rPr>
+          <w:b w:val="false"/>
+          <w:i w:val="false"/>
+          <w:strike w:val="false"/>
+          <w:dstrike w:val="false"/>
+          <w:sz w:val="20"/>
+          <w:u w:val="none"/>
+        </w:rPr>
+      </w:pPr>
+      <w:r>
+        <w:rPr>
+          <w:b/>
+          <w:i w:val="false"/>
+          <w:strike w:val="false"/>
+          <w:dstrike w:val="false"/>
+          <w:sz w:val="20"/>
+          <w:u w:val="none"/>
+        </w:rPr>
+        <w:t xml:space="preserve">U.S. Marine Corps </w:t>
+      </w:r>
+      <w:r>
+        <w:rPr>
+          <w:b w:val="false"/>
+          <w:i w:val="false"/>
+          <w:strike w:val="false"/>
+          <w:dstrike w:val="false"/>
+          <w:sz w:val="20"/>
+          <w:u w:val="none"/>
+        </w:rPr>
+        <w:t xml:space="preserve">| Combat Engineer / Operations NCO </w:t>
+      </w:r>
+      <w:r>
+        <w:rPr>
+          <w:b/>
+          <w:i w:val="false"/>
+          <w:strike w:val="false"/>
+          <w:dstrike w:val="false"/>
+          <w:sz w:val="20"/>
+          <w:u w:val="none"/>
+        </w:rPr>
+        <w:t xml:space="preserve">2004 - 2012 </w:t>
+      </w:r>
+    </w:p>
+    <w:p>
+      <w:pPr>
+        <w:pStyle w:val="Default"/>
+        <w:bidi w:val="0"/>
+        <w:jc w:val="left"/>
+        <w:rPr>
+          <w:b w:val="false"/>
+          <w:i w:val="false"/>
+          <w:strike w:val="false"/>
+          <w:dstrike w:val="false"/>
+          <w:color w:val="444444"/>
+          <w:sz w:val="18"/>
+          <w:u w:val="none"/>
+        </w:rPr>
+      </w:pPr>
       <w:r>
         <w:rPr>
           <w:b w:val="false"/>
@@ -868,191 +999,6 @@
           <w:sz w:val="18"/>
           <w:u w:val="none"/>
         </w:rPr>
-        <w:t>Panama City Beach</w:t>
-      </w:r>
-      <w:r>
-        <w:rPr>
-          <w:b w:val="false"/>
-          <w:i/>
-          <w:strike w:val="false"/>
-          <w:dstrike w:val="false"/>
-          <w:color w:val="444444"/>
-          <w:sz w:val="18"/>
-          <w:u w:val="none"/>
-        </w:rPr>
-        <w:t xml:space="preserve">, FL </w:t>
-      </w:r>
-      <w:r>
-        <w:rPr>
-          <w:b w:val="false"/>
-          <w:i/>
-          <w:strike w:val="false"/>
-          <w:dstrike w:val="false"/>
-          <w:color w:val="444444"/>
-          <w:sz w:val="18"/>
-          <w:u w:val="none"/>
-        </w:rPr>
-        <w:t>and Birmingham, AL</w:t>
-      </w:r>
-    </w:p>
-    <w:p>
-      <w:pPr>
-        <w:pStyle w:val="Default"/>
-        <w:bidi w:val="0"/>
-        <w:jc w:val="start"/>
-        <w:rPr>
-          <w:b w:val="false"/>
-          <w:i w:val="false"/>
-          <w:strike w:val="false"/>
-          <w:dstrike w:val="false"/>
-          <w:sz w:val="20"/>
-          <w:u w:val="none"/>
-        </w:rPr>
-      </w:pPr>
-      <w:r>
-        <w:rPr>
-          <w:b w:val="false"/>
-          <w:i w:val="false"/>
-          <w:strike w:val="false"/>
-          <w:dstrike w:val="false"/>
-          <w:sz w:val="18"/>
-          <w:szCs w:val="18"/>
-          <w:u w:val="none"/>
-        </w:rPr>
-        <w:t>•</w:t>
-      </w:r>
-      <w:r>
-        <w:rPr>
-          <w:sz w:val="18"/>
-          <w:szCs w:val="18"/>
-        </w:rPr>
-        <w:t xml:space="preserve">Managed 15–20 concurrent residential projects, coordinating 20–30 subcontractors while overseeing budgets up to $5M and consistently delivering on time and within scope </w:t>
-      </w:r>
-    </w:p>
-    <w:p>
-      <w:pPr>
-        <w:pStyle w:val="Default"/>
-        <w:bidi w:val="0"/>
-        <w:jc w:val="start"/>
-        <w:rPr>
-          <w:b w:val="false"/>
-          <w:i w:val="false"/>
-          <w:strike w:val="false"/>
-          <w:dstrike w:val="false"/>
-          <w:sz w:val="20"/>
-          <w:u w:val="none"/>
-        </w:rPr>
-      </w:pPr>
-      <w:r>
-        <w:rPr>
-          <w:b w:val="false"/>
-          <w:i w:val="false"/>
-          <w:strike w:val="false"/>
-          <w:dstrike w:val="false"/>
-          <w:sz w:val="20"/>
-          <w:u w:val="none"/>
-        </w:rPr>
-      </w:r>
-    </w:p>
-    <w:p>
-      <w:pPr>
-        <w:pStyle w:val="Default"/>
-        <w:bidi w:val="0"/>
-        <w:jc w:val="start"/>
-        <w:rPr>
-          <w:b w:val="false"/>
-          <w:i w:val="false"/>
-          <w:strike w:val="false"/>
-          <w:dstrike w:val="false"/>
-          <w:sz w:val="20"/>
-          <w:u w:val="none"/>
-        </w:rPr>
-      </w:pPr>
-      <w:r>
-        <w:rPr>
-          <w:b/>
-          <w:i w:val="false"/>
-          <w:strike w:val="false"/>
-          <w:dstrike w:val="false"/>
-          <w:sz w:val="20"/>
-          <w:u w:val="none"/>
-        </w:rPr>
-        <w:t xml:space="preserve">MILITARY &amp; LEADERSHIP </w:t>
-      </w:r>
-    </w:p>
-    <w:p>
-      <w:pPr>
-        <w:pStyle w:val="Default"/>
-        <w:bidi w:val="0"/>
-        <w:jc w:val="start"/>
-        <w:rPr>
-          <w:b w:val="false"/>
-          <w:i w:val="false"/>
-          <w:strike w:val="false"/>
-          <w:dstrike w:val="false"/>
-          <w:sz w:val="20"/>
-          <w:u w:val="none"/>
-        </w:rPr>
-      </w:pPr>
-      <w:r>
-        <w:rPr>
-          <w:b/>
-          <w:i w:val="false"/>
-          <w:strike w:val="false"/>
-          <w:dstrike w:val="false"/>
-          <w:sz w:val="20"/>
-          <w:u w:val="none"/>
-        </w:rPr>
-        <w:t xml:space="preserve">U.S. Marine Corps </w:t>
-      </w:r>
-      <w:r>
-        <w:rPr>
-          <w:b w:val="false"/>
-          <w:i w:val="false"/>
-          <w:strike w:val="false"/>
-          <w:dstrike w:val="false"/>
-          <w:sz w:val="20"/>
-          <w:u w:val="none"/>
-        </w:rPr>
-        <w:t xml:space="preserve">| Combat Engineer / Operations NCO </w:t>
-      </w:r>
-      <w:r>
-        <w:rPr>
-          <w:b/>
-          <w:i w:val="false"/>
-          <w:strike w:val="false"/>
-          <w:dstrike w:val="false"/>
-          <w:sz w:val="20"/>
-          <w:u w:val="none"/>
-        </w:rPr>
-        <w:t xml:space="preserve">2004 - 2012 </w:t>
-      </w:r>
-    </w:p>
-    <w:p>
-      <w:pPr>
-        <w:pStyle w:val="Default"/>
-        <w:bidi w:val="0"/>
-        <w:jc w:val="start"/>
-        <w:rPr>
-          <w:b w:val="false"/>
-          <w:i w:val="false"/>
-          <w:strike w:val="false"/>
-          <w:dstrike w:val="false"/>
-          <w:color w:val="444444"/>
-          <w:sz w:val="18"/>
-          <w:u w:val="none"/>
-        </w:rPr>
-      </w:pPr>
-      <w:r>
-        <w:rPr>
-          <w:b w:val="false"/>
-          <w:i/>
-          <w:strike w:val="false"/>
-          <w:dstrike w:val="false"/>
-          <w:color w:val="444444"/>
-          <w:sz w:val="18"/>
-          <w:u w:val="none"/>
-        </w:rPr>
         <w:t xml:space="preserve">Active Duty </w:t>
       </w:r>
     </w:p>
@@ -1060,7 +1006,7 @@
       <w:pPr>
         <w:pStyle w:val="Default"/>
         <w:bidi w:val="0"/>
-        <w:jc w:val="start"/>
+        <w:jc w:val="left"/>
         <w:rPr>
           <w:b w:val="false"/>
           <w:i w:val="false"/>
@@ -1103,32 +1049,32 @@
       <w:pPr>
         <w:pStyle w:val="Default"/>
         <w:bidi w:val="0"/>
-        <w:jc w:val="start"/>
-        <w:rPr>
-          <w:b w:val="false"/>
-          <w:i w:val="false"/>
-          <w:strike w:val="false"/>
-          <w:dstrike w:val="false"/>
-          <w:sz w:val="20"/>
-          <w:u w:val="none"/>
-        </w:rPr>
-      </w:pPr>
-      <w:r>
-        <w:rPr>
-          <w:b w:val="false"/>
-          <w:i w:val="false"/>
-          <w:strike w:val="false"/>
-          <w:dstrike w:val="false"/>
-          <w:sz w:val="20"/>
-          <w:u w:val="none"/>
-        </w:rPr>
-      </w:r>
-    </w:p>
-    <w:p>
-      <w:pPr>
-        <w:pStyle w:val="Default"/>
-        <w:bidi w:val="0"/>
-        <w:jc w:val="start"/>
+        <w:jc w:val="left"/>
+        <w:rPr>
+          <w:b w:val="false"/>
+          <w:i w:val="false"/>
+          <w:strike w:val="false"/>
+          <w:dstrike w:val="false"/>
+          <w:sz w:val="20"/>
+          <w:u w:val="none"/>
+        </w:rPr>
+      </w:pPr>
+      <w:r>
+        <w:rPr>
+          <w:b w:val="false"/>
+          <w:i w:val="false"/>
+          <w:strike w:val="false"/>
+          <w:dstrike w:val="false"/>
+          <w:sz w:val="20"/>
+          <w:u w:val="none"/>
+        </w:rPr>
+      </w:r>
+    </w:p>
+    <w:p>
+      <w:pPr>
+        <w:pStyle w:val="Default"/>
+        <w:bidi w:val="0"/>
+        <w:jc w:val="left"/>
         <w:rPr>
           <w:b w:val="false"/>
           <w:i w:val="false"/>
@@ -1176,7 +1122,7 @@
       <w:pPr>
         <w:pStyle w:val="Default"/>
         <w:bidi w:val="0"/>
-        <w:jc w:val="start"/>
+        <w:jc w:val="left"/>
         <w:rPr>
           <w:b w:val="false"/>
           <w:i w:val="false"/>
@@ -1204,7 +1150,7 @@
       <w:pPr>
         <w:pStyle w:val="Default"/>
         <w:bidi w:val="0"/>
-        <w:jc w:val="start"/>
+        <w:jc w:val="left"/>
         <w:rPr>
           <w:b w:val="false"/>
           <w:i w:val="false"/>
@@ -1226,54 +1172,39 @@
           <w:sz w:val="18"/>
           <w:szCs w:val="18"/>
         </w:rPr>
-        <w:t xml:space="preserve">Led teams in reconnaissance, surveillance, </w:t>
-      </w:r>
-      <w:r>
-        <w:rPr>
-          <w:sz w:val="18"/>
-          <w:szCs w:val="18"/>
-        </w:rPr>
-        <w:t xml:space="preserve">disaster relief </w:t>
-      </w:r>
-      <w:r>
-        <w:rPr>
-          <w:sz w:val="18"/>
-          <w:szCs w:val="18"/>
-        </w:rPr>
-        <w:t xml:space="preserve">and high-pressure operational environments requiring rapid decision-making and mission-focused execution </w:t>
-      </w:r>
-    </w:p>
-    <w:p>
-      <w:pPr>
-        <w:pStyle w:val="Default"/>
-        <w:bidi w:val="0"/>
-        <w:jc w:val="start"/>
-        <w:rPr>
-          <w:b w:val="false"/>
-          <w:i w:val="false"/>
-          <w:strike w:val="false"/>
-          <w:dstrike w:val="false"/>
-          <w:sz w:val="20"/>
-          <w:u w:val="none"/>
-        </w:rPr>
-      </w:pPr>
-      <w:r>
-        <w:rPr>
-          <w:b w:val="false"/>
-          <w:i w:val="false"/>
-          <w:strike w:val="false"/>
-          <w:dstrike w:val="false"/>
-          <w:sz w:val="20"/>
-          <w:szCs w:val="20"/>
-          <w:u w:val="none"/>
-        </w:rPr>
-      </w:r>
-    </w:p>
-    <w:p>
-      <w:pPr>
-        <w:pStyle w:val="Default"/>
-        <w:bidi w:val="0"/>
-        <w:jc w:val="start"/>
+        <w:t xml:space="preserve">Led teams in reconnaissance, surveillance, disaster relief and high-pressure operational environments requiring rapid decision-making and mission-focused execution </w:t>
+      </w:r>
+    </w:p>
+    <w:p>
+      <w:pPr>
+        <w:pStyle w:val="Default"/>
+        <w:bidi w:val="0"/>
+        <w:jc w:val="left"/>
+        <w:rPr>
+          <w:b w:val="false"/>
+          <w:i w:val="false"/>
+          <w:strike w:val="false"/>
+          <w:dstrike w:val="false"/>
+          <w:sz w:val="20"/>
+          <w:u w:val="none"/>
+        </w:rPr>
+      </w:pPr>
+      <w:r>
+        <w:rPr>
+          <w:b w:val="false"/>
+          <w:i w:val="false"/>
+          <w:strike w:val="false"/>
+          <w:dstrike w:val="false"/>
+          <w:sz w:val="20"/>
+          <w:u w:val="none"/>
+        </w:rPr>
+      </w:r>
+    </w:p>
+    <w:p>
+      <w:pPr>
+        <w:pStyle w:val="Default"/>
+        <w:bidi w:val="0"/>
+        <w:jc w:val="left"/>
         <w:rPr>
           <w:b w:val="false"/>
           <w:i w:val="false"/>
@@ -1305,11 +1236,12 @@
           <w:sz w:val="18"/>
           <w:u w:val="none"/>
         </w:rPr>
-        <w:t>|</w:t>
-      </w:r>
-      <w:r>
-        <w:rPr>
-          <w:b w:val="false"/>
+        <w:t xml:space="preserve">|Combat Tactics Instructor </w:t>
+      </w:r>
+      <w:r>
+        <w:rPr>
+          <w:b/>
+          <w:bCs/>
           <w:i w:val="false"/>
           <w:strike w:val="false"/>
           <w:dstrike w:val="false"/>
@@ -1317,12 +1249,11 @@
           <w:sz w:val="18"/>
           <w:u w:val="none"/>
         </w:rPr>
-        <w:t xml:space="preserve">Combat Tactics Instructor </w:t>
-      </w:r>
-      <w:r>
-        <w:rPr>
-          <w:b/>
-          <w:bCs/>
+        <w:t>2014 - 2016</w:t>
+      </w:r>
+      <w:r>
+        <w:rPr>
+          <w:b w:val="false"/>
           <w:i w:val="false"/>
           <w:strike w:val="false"/>
           <w:dstrike w:val="false"/>
@@ -1330,18 +1261,6 @@
           <w:sz w:val="18"/>
           <w:u w:val="none"/>
         </w:rPr>
-        <w:t>2014 - 2016</w:t>
-      </w:r>
-      <w:r>
-        <w:rPr>
-          <w:b w:val="false"/>
-          <w:i w:val="false"/>
-          <w:strike w:val="false"/>
-          <w:dstrike w:val="false"/>
-          <w:color w:val="444444"/>
-          <w:sz w:val="18"/>
-          <w:u w:val="none"/>
-        </w:rPr>
         <w:t xml:space="preserve"> </w:t>
       </w:r>
     </w:p>
@@ -1349,7 +1268,7 @@
       <w:pPr>
         <w:pStyle w:val="Default"/>
         <w:bidi w:val="0"/>
-        <w:jc w:val="start"/>
+        <w:jc w:val="left"/>
         <w:rPr>
           <w:b w:val="false"/>
           <w:i w:val="false"/>
@@ -1378,7 +1297,7 @@
       <w:pPr>
         <w:pStyle w:val="Default"/>
         <w:bidi w:val="0"/>
-        <w:jc w:val="start"/>
+        <w:jc w:val="left"/>
         <w:rPr>
           <w:b w:val="false"/>
           <w:i w:val="false"/>
@@ -1410,55 +1329,30 @@
           <w:szCs w:val="18"/>
           <w:u w:val="none"/>
         </w:rPr>
-        <w:t xml:space="preserve">Taught and led scenario based training </w:t>
-      </w:r>
-      <w:r>
-        <w:rPr>
-          <w:b w:val="false"/>
-          <w:i w:val="false"/>
-          <w:strike w:val="false"/>
-          <w:dstrike w:val="false"/>
-          <w:sz w:val="18"/>
-          <w:szCs w:val="18"/>
-          <w:u w:val="none"/>
-        </w:rPr>
-        <w:t>in</w:t>
-      </w:r>
-      <w:r>
-        <w:rPr>
-          <w:b w:val="false"/>
-          <w:i w:val="false"/>
-          <w:strike w:val="false"/>
-          <w:dstrike w:val="false"/>
-          <w:sz w:val="18"/>
-          <w:szCs w:val="18"/>
-          <w:u w:val="none"/>
-        </w:rPr>
-        <w:t xml:space="preserve"> land navigation, combat patrolling, and combat tactics.</w:t>
-      </w:r>
-    </w:p>
-    <w:p>
-      <w:pPr>
-        <w:pStyle w:val="Default"/>
-        <w:bidi w:val="0"/>
-        <w:jc w:val="start"/>
-        <w:rPr>
-          <w:b w:val="false"/>
-          <w:i w:val="false"/>
-          <w:strike w:val="false"/>
-          <w:dstrike w:val="false"/>
-          <w:sz w:val="20"/>
-          <w:u w:val="none"/>
-        </w:rPr>
-      </w:pPr>
-      <w:r>
-        <w:rPr>
-          <w:b w:val="false"/>
-          <w:i w:val="false"/>
-          <w:strike w:val="false"/>
-          <w:dstrike w:val="false"/>
-          <w:sz w:val="18"/>
-          <w:szCs w:val="18"/>
+        <w:t>Taught and led scenario based training in land navigation, combat patrolling, and combat tactics.</w:t>
+      </w:r>
+    </w:p>
+    <w:p>
+      <w:pPr>
+        <w:pStyle w:val="Default"/>
+        <w:bidi w:val="0"/>
+        <w:jc w:val="left"/>
+        <w:rPr>
+          <w:b w:val="false"/>
+          <w:i w:val="false"/>
+          <w:strike w:val="false"/>
+          <w:dstrike w:val="false"/>
+          <w:sz w:val="20"/>
+          <w:u w:val="none"/>
+        </w:rPr>
+      </w:pPr>
+      <w:r>
+        <w:rPr>
+          <w:b w:val="false"/>
+          <w:i w:val="false"/>
+          <w:strike w:val="false"/>
+          <w:dstrike w:val="false"/>
+          <w:sz w:val="20"/>
           <w:u w:val="none"/>
         </w:rPr>
       </w:r>
@@ -1467,7 +1361,7 @@
       <w:pPr>
         <w:pStyle w:val="Normal"/>
         <w:bidi w:val="0"/>
-        <w:jc w:val="start"/>
+        <w:jc w:val="left"/>
         <w:rPr>
           <w:b w:val="false"/>
           <w:i w:val="false"/>
@@ -1493,7 +1387,7 @@
       <w:pPr>
         <w:pStyle w:val="Default"/>
         <w:bidi w:val="0"/>
-        <w:jc w:val="start"/>
+        <w:jc w:val="left"/>
         <w:rPr>
           <w:b w:val="false"/>
           <w:i w:val="false"/>
@@ -1531,7 +1425,7 @@
       <w:pPr>
         <w:pStyle w:val="Default"/>
         <w:bidi w:val="0"/>
-        <w:jc w:val="start"/>
+        <w:jc w:val="left"/>
         <w:rPr>
           <w:b w:val="false"/>
           <w:i w:val="false"/>
@@ -1569,7 +1463,7 @@
       <w:pPr>
         <w:pStyle w:val="Default"/>
         <w:bidi w:val="0"/>
-        <w:jc w:val="start"/>
+        <w:jc w:val="left"/>
         <w:rPr>
           <w:b w:val="false"/>
           <w:i w:val="false"/>
@@ -1618,7 +1512,7 @@
       <w:pPr>
         <w:pStyle w:val="Default"/>
         <w:bidi w:val="0"/>
-        <w:jc w:val="start"/>
+        <w:jc w:val="left"/>
         <w:rPr>
           <w:b w:val="false"/>
           <w:i w:val="false"/>
@@ -1659,7 +1553,7 @@
       <w:pgNumType w:fmt="decimal"/>
       <w:formProt w:val="false"/>
       <w:textDirection w:val="lrTb"/>
-      <w:docGrid w:type="default" w:linePitch="312" w:charSpace="4294961151"/>
+      <w:docGrid w:type="default" w:linePitch="312" w:charSpace="0"/>
     </w:sectPr>
   </w:body>
 </w:document>
@@ -1679,7 +1573,6 @@
     </w:rPrDefault>
     <w:pPrDefault>
       <w:pPr>
-        <w:widowControl/>
         <w:suppressAutoHyphens w:val="true"/>
       </w:pPr>
     </w:pPrDefault>
@@ -1689,7 +1582,13 @@
     <w:qFormat/>
     <w:pPr>
       <w:widowControl/>
+      <w:suppressAutoHyphens w:val="true"/>
+      <w:kinsoku w:val="true"/>
+      <w:overflowPunct w:val="true"/>
+      <w:autoSpaceDE w:val="true"/>
       <w:bidi w:val="0"/>
+      <w:spacing w:before="0" w:after="0"/>
+      <w:jc w:val="left"/>
     </w:pPr>
     <w:rPr>
       <w:rFonts w:ascii="Liberation Serif" w:hAnsi="Liberation Serif" w:eastAsia="NSimSun" w:cs="Arial"/>
@@ -1700,8 +1599,8 @@
       <w:lang w:val="en-US" w:eastAsia="zh-CN" w:bidi="hi-IN"/>
     </w:rPr>
   </w:style>
-  <w:style w:type="character" w:styleId="Bullets">
-    <w:name w:val="Bullets"/>
+  <w:style w:type="character" w:styleId="Bulletsuser">
+    <w:name w:val="Bullets (user)"/>
     <w:qFormat/>
     <w:rPr>
       <w:rFonts w:ascii="OpenSymbol" w:hAnsi="OpenSymbol" w:eastAsia="OpenSymbol" w:cs="OpenSymbol"/>
@@ -1777,8 +1676,13 @@
     <w:qFormat/>
     <w:pPr>
       <w:widowControl/>
+      <w:suppressAutoHyphens w:val="true"/>
+      <w:kinsoku w:val="true"/>
+      <w:overflowPunct w:val="true"/>
+      <w:autoSpaceDE w:val="true"/>
       <w:bidi w:val="0"/>
-      <w:jc w:val="start"/>
+      <w:spacing w:before="0" w:after="0"/>
+      <w:jc w:val="left"/>
     </w:pPr>
     <w:rPr>
       <w:rFonts w:ascii="Arial" w:hAnsi="Arial" w:eastAsia="NSimSun" w:cs="Arial"/>

</xml_diff>